<commit_message>
Updated Modules & Security enhancements
</commit_message>
<xml_diff>
--- a/analysis/Angerona_Security_Assessment_v2.0_2026-07-13.docx
+++ b/analysis/Angerona_Security_Assessment_v2.0_2026-07-13.docx
@@ -274,14 +274,15 @@
             <w:tcW w:type="dxa" w:w="1728"/>
           </w:tcPr>
           <w:p>
-            <w:r/>
+            <w:r>
+              <w:t>MITIGATED</w:t>
+            </w:r>
             <w:r>
               <w:rPr>
                 <w:b/>
                 <w:color w:val="1E7A33"/>
                 <w:sz w:val="19"/>
               </w:rPr>
-              <w:t>MITIGATED</w:t>
             </w:r>
           </w:p>
         </w:tc>
@@ -350,14 +351,15 @@
             <w:tcW w:type="dxa" w:w="1728"/>
           </w:tcPr>
           <w:p>
-            <w:r/>
+            <w:r>
+              <w:t>MITIGATED</w:t>
+            </w:r>
             <w:r>
               <w:rPr>
                 <w:b/>
                 <w:color w:val="1E7A33"/>
                 <w:sz w:val="19"/>
               </w:rPr>
-              <w:t>MITIGATED</w:t>
             </w:r>
           </w:p>
         </w:tc>
@@ -426,14 +428,15 @@
             <w:tcW w:type="dxa" w:w="1728"/>
           </w:tcPr>
           <w:p>
-            <w:r/>
+            <w:r>
+              <w:t>MITIGATED - strict generated-containment gate</w:t>
+            </w:r>
             <w:r>
               <w:rPr>
                 <w:b/>
                 <w:color w:val="1E7A33"/>
                 <w:sz w:val="19"/>
               </w:rPr>
-              <w:t>MITIGATED</w:t>
             </w:r>
           </w:p>
         </w:tc>
@@ -502,12 +505,13 @@
             <w:tcW w:type="dxa" w:w="1728"/>
           </w:tcPr>
           <w:p>
-            <w:r/>
+            <w:r>
+              <w:t>DEFERRED - trust-root boundary incomplete</w:t>
+            </w:r>
             <w:r>
               <w:rPr>
                 <w:sz w:val="19"/>
               </w:rPr>
-              <w:t>OPEN (by design)</w:t>
             </w:r>
           </w:p>
         </w:tc>
@@ -576,14 +580,15 @@
             <w:tcW w:type="dxa" w:w="1728"/>
           </w:tcPr>
           <w:p>
-            <w:r/>
+            <w:r>
+              <w:t>MITIGATED</w:t>
+            </w:r>
             <w:r>
               <w:rPr>
                 <w:b/>
                 <w:color w:val="1E7A33"/>
                 <w:sz w:val="19"/>
               </w:rPr>
-              <w:t>MITIGATED</w:t>
             </w:r>
           </w:p>
         </w:tc>
@@ -652,12 +657,13 @@
             <w:tcW w:type="dxa" w:w="1728"/>
           </w:tcPr>
           <w:p>
-            <w:r/>
+            <w:r>
+              <w:t>OPEN</w:t>
+            </w:r>
             <w:r>
               <w:rPr>
                 <w:sz w:val="19"/>
               </w:rPr>
-              <w:t>OPEN</w:t>
             </w:r>
           </w:p>
         </w:tc>
@@ -726,12 +732,13 @@
             <w:tcW w:type="dxa" w:w="1728"/>
           </w:tcPr>
           <w:p>
-            <w:r/>
+            <w:r>
+              <w:t>CLOSED</w:t>
+            </w:r>
             <w:r>
               <w:rPr>
                 <w:sz w:val="19"/>
               </w:rPr>
-              <w:t>OPEN</w:t>
             </w:r>
           </w:p>
         </w:tc>
@@ -1572,6 +1579,770 @@
         <w:t>Recommended next: dependency CVE audit (pip-audit) and a dynamic/runtime test pass.</w:t>
       </w:r>
     </w:p>
+    <w:p>
+      <w:r>
+        <w:br w:type="page"/>
+      </w:r>
+    </w:p>
+    <w:p>
+      <w:pPr>
+        <w:pStyle w:val="Heading1"/>
+        <w:keepNext/>
+      </w:pPr>
+      <w:r>
+        <w:rPr>
+          <w:color w:val="0078D4"/>
+        </w:rPr>
+        <w:t>Stability and Remediation Sweep — 14 July 2026</w:t>
+      </w:r>
+    </w:p>
+    <w:p>
+      <w:r>
+        <w:rPr>
+          <w:i/>
+        </w:rPr>
+        <w:t>This addendum records the code, performance, crash-log, and remediation-report sweep completed against the Angerona v1.7.4 baseline. It supplements earlier assessment text; it is internal validation evidence, not an independent certification.</w:t>
+      </w:r>
+    </w:p>
+    <w:p>
+      <w:pPr>
+        <w:pStyle w:val="Heading2"/>
+      </w:pPr>
+      <w:r>
+        <w:t>Evidence reviewed</w:t>
+      </w:r>
+    </w:p>
+    <w:p>
+      <w:pPr>
+        <w:pStyle w:val="ListBullet"/>
+      </w:pPr>
+      <w:r>
+        <w:t>Native crash history, UI non-response snapshots, remediation-attempt logs, and current after-action reports.</w:t>
+      </w:r>
+    </w:p>
+    <w:p>
+      <w:pPr>
+        <w:pStyle w:val="ListBullet"/>
+      </w:pPr>
+      <w:r>
+        <w:t>Security Assessment v2.0, Vulnerabilities Assessment/Remediation v1.7.4, and loop remediation summaries.</w:t>
+      </w:r>
+    </w:p>
+    <w:p>
+      <w:pPr>
+        <w:pStyle w:val="ListBullet"/>
+      </w:pPr>
+      <w:r>
+        <w:t>Current source, GUI refresh paths, event/storage behavior, module discovery, and PowerShell remediation gates.</w:t>
+      </w:r>
+    </w:p>
+    <w:p>
+      <w:pPr>
+        <w:pStyle w:val="Heading2"/>
+      </w:pPr>
+      <w:r>
+        <w:t>Implemented corrections</w:t>
+      </w:r>
+    </w:p>
+    <w:tbl>
+      <w:tblPr>
+        <w:tblStyle w:val="TableGrid"/>
+        <w:tblW w:type="auto" w:w="0"/>
+        <w:tblLayout w:type="fixed"/>
+        <w:tblLook w:firstColumn="1" w:firstRow="1" w:lastColumn="0" w:lastRow="0" w:noHBand="0" w:noVBand="1" w:val="04A0"/>
+      </w:tblPr>
+      <w:tblGrid>
+        <w:gridCol w:w="1944"/>
+        <w:gridCol w:w="2880"/>
+        <w:gridCol w:w="5112"/>
+      </w:tblGrid>
+      <w:tr>
+        <w:tc>
+          <w:tcPr>
+            <w:tcW w:type="dxa" w:w="2880"/>
+            <w:vAlign w:val="center"/>
+            <w:shd w:fill="1F4E78"/>
+          </w:tcPr>
+          <w:p>
+            <w:r/>
+            <w:r>
+              <w:rPr>
+                <w:rFonts w:ascii="Aptos" w:hAnsi="Aptos"/>
+                <w:b/>
+                <w:color w:val="FFFFFF"/>
+                <w:sz w:val="19"/>
+              </w:rPr>
+              <w:t>Area</w:t>
+            </w:r>
+          </w:p>
+        </w:tc>
+        <w:tc>
+          <w:tcPr>
+            <w:tcW w:type="dxa" w:w="2880"/>
+            <w:vAlign w:val="center"/>
+            <w:shd w:fill="1F4E78"/>
+          </w:tcPr>
+          <w:p>
+            <w:r/>
+            <w:r>
+              <w:rPr>
+                <w:rFonts w:ascii="Aptos" w:hAnsi="Aptos"/>
+                <w:b/>
+                <w:color w:val="FFFFFF"/>
+                <w:sz w:val="19"/>
+              </w:rPr>
+              <w:t>Status</w:t>
+            </w:r>
+          </w:p>
+        </w:tc>
+        <w:tc>
+          <w:tcPr>
+            <w:tcW w:type="dxa" w:w="2880"/>
+            <w:vAlign w:val="center"/>
+            <w:shd w:fill="1F4E78"/>
+          </w:tcPr>
+          <w:p>
+            <w:r/>
+            <w:r>
+              <w:rPr>
+                <w:rFonts w:ascii="Aptos" w:hAnsi="Aptos"/>
+                <w:b/>
+                <w:color w:val="FFFFFF"/>
+                <w:sz w:val="19"/>
+              </w:rPr>
+              <w:t>Correction</w:t>
+            </w:r>
+          </w:p>
+        </w:tc>
+      </w:tr>
+      <w:tr>
+        <w:tc>
+          <w:tcPr>
+            <w:tcW w:type="dxa" w:w="1944"/>
+            <w:vAlign w:val="center"/>
+          </w:tcPr>
+          <w:p>
+            <w:r/>
+            <w:r>
+              <w:rPr>
+                <w:rFonts w:ascii="Aptos" w:hAnsi="Aptos"/>
+                <w:b/>
+                <w:sz w:val="19"/>
+              </w:rPr>
+              <w:t>Native stability</w:t>
+            </w:r>
+          </w:p>
+        </w:tc>
+        <w:tc>
+          <w:tcPr>
+            <w:tcW w:type="dxa" w:w="2880"/>
+            <w:vAlign w:val="center"/>
+          </w:tcPr>
+          <w:p>
+            <w:r/>
+            <w:r>
+              <w:rPr>
+                <w:rFonts w:ascii="Aptos" w:hAnsi="Aptos"/>
+                <w:b/>
+                <w:color w:val="087F5B"/>
+                <w:sz w:val="19"/>
+              </w:rPr>
+              <w:t>Fixed by safe default</w:t>
+            </w:r>
+          </w:p>
+        </w:tc>
+        <w:tc>
+          <w:tcPr>
+            <w:tcW w:type="dxa" w:w="5112"/>
+            <w:vAlign w:val="center"/>
+          </w:tcPr>
+          <w:p>
+            <w:r/>
+            <w:r>
+              <w:rPr>
+                <w:rFonts w:ascii="Aptos" w:hAnsi="Aptos"/>
+                <w:b w:val="0"/>
+                <w:sz w:val="19"/>
+              </w:rPr>
+              <w:t>Twenty-one recorded native access violations converged on direct in-process AmsiScanBuffer health checks. AMSI Bridge now defaults to ETW/Sysmon observation; direct ctypes AMSI is explicit compatibility-test opt-in only.</w:t>
+            </w:r>
+          </w:p>
+        </w:tc>
+      </w:tr>
+      <w:tr>
+        <w:tc>
+          <w:tcPr>
+            <w:tcW w:type="dxa" w:w="1944"/>
+            <w:vAlign w:val="center"/>
+          </w:tcPr>
+          <w:p>
+            <w:r/>
+            <w:r>
+              <w:rPr>
+                <w:rFonts w:ascii="Aptos" w:hAnsi="Aptos"/>
+                <w:b/>
+                <w:sz w:val="19"/>
+              </w:rPr>
+              <w:t>Long-run UI</w:t>
+            </w:r>
+          </w:p>
+        </w:tc>
+        <w:tc>
+          <w:tcPr>
+            <w:tcW w:type="dxa" w:w="2880"/>
+            <w:vAlign w:val="center"/>
+          </w:tcPr>
+          <w:p>
+            <w:r/>
+            <w:r>
+              <w:rPr>
+                <w:rFonts w:ascii="Aptos" w:hAnsi="Aptos"/>
+                <w:b/>
+                <w:color w:val="087F5B"/>
+                <w:sz w:val="19"/>
+              </w:rPr>
+              <w:t>Fixed</w:t>
+            </w:r>
+          </w:p>
+        </w:tc>
+        <w:tc>
+          <w:tcPr>
+            <w:tcW w:type="dxa" w:w="5112"/>
+            <w:vAlign w:val="center"/>
+          </w:tcPr>
+          <w:p>
+            <w:r/>
+            <w:r>
+              <w:rPr>
+                <w:rFonts w:ascii="Aptos" w:hAnsi="Aptos"/>
+                <w:b w:val="0"/>
+                <w:sz w:val="19"/>
+              </w:rPr>
+              <w:t>Flight Instructor work is bounded to one worker and an eight-item coalescing queue; flow-metric disk writes are off the Qt thread; alert-table gap rebuilds are burst-throttled.</w:t>
+            </w:r>
+          </w:p>
+        </w:tc>
+      </w:tr>
+      <w:tr>
+        <w:tc>
+          <w:tcPr>
+            <w:tcW w:type="dxa" w:w="1944"/>
+            <w:vAlign w:val="center"/>
+          </w:tcPr>
+          <w:p>
+            <w:r/>
+            <w:r>
+              <w:rPr>
+                <w:rFonts w:ascii="Aptos" w:hAnsi="Aptos"/>
+                <w:b/>
+                <w:sz w:val="19"/>
+              </w:rPr>
+              <w:t>Diagnostics</w:t>
+            </w:r>
+          </w:p>
+        </w:tc>
+        <w:tc>
+          <w:tcPr>
+            <w:tcW w:type="dxa" w:w="2880"/>
+            <w:vAlign w:val="center"/>
+          </w:tcPr>
+          <w:p>
+            <w:r/>
+            <w:r>
+              <w:rPr>
+                <w:rFonts w:ascii="Aptos" w:hAnsi="Aptos"/>
+                <w:b/>
+                <w:color w:val="087F5B"/>
+                <w:sz w:val="19"/>
+              </w:rPr>
+              <w:t>Fixed</w:t>
+            </w:r>
+          </w:p>
+        </w:tc>
+        <w:tc>
+          <w:tcPr>
+            <w:tcW w:type="dxa" w:w="5112"/>
+            <w:vAlign w:val="center"/>
+          </w:tcPr>
+          <w:p>
+            <w:r/>
+            <w:r>
+              <w:rPr>
+                <w:rFonts w:ascii="Aptos" w:hAnsi="Aptos"/>
+                <w:b w:val="0"/>
+                <w:sz w:val="19"/>
+              </w:rPr>
+              <w:t>UI watchdog snapshots are main-thread focused, rate-limited to 60 seconds, and rotated at 4 MB instead of growing without bound.</w:t>
+            </w:r>
+          </w:p>
+        </w:tc>
+      </w:tr>
+      <w:tr>
+        <w:tc>
+          <w:tcPr>
+            <w:tcW w:type="dxa" w:w="1944"/>
+            <w:vAlign w:val="center"/>
+          </w:tcPr>
+          <w:p>
+            <w:r/>
+            <w:r>
+              <w:rPr>
+                <w:rFonts w:ascii="Aptos" w:hAnsi="Aptos"/>
+                <w:b/>
+                <w:sz w:val="19"/>
+              </w:rPr>
+              <w:t>Event delivery</w:t>
+            </w:r>
+          </w:p>
+        </w:tc>
+        <w:tc>
+          <w:tcPr>
+            <w:tcW w:type="dxa" w:w="2880"/>
+            <w:vAlign w:val="center"/>
+          </w:tcPr>
+          <w:p>
+            <w:r/>
+            <w:r>
+              <w:rPr>
+                <w:rFonts w:ascii="Aptos" w:hAnsi="Aptos"/>
+                <w:b/>
+                <w:color w:val="087F5B"/>
+                <w:sz w:val="19"/>
+              </w:rPr>
+              <w:t>Fixed</w:t>
+            </w:r>
+          </w:p>
+        </w:tc>
+        <w:tc>
+          <w:tcPr>
+            <w:tcW w:type="dxa" w:w="5112"/>
+            <w:vAlign w:val="center"/>
+          </w:tcPr>
+          <w:p>
+            <w:r/>
+            <w:r>
+              <w:rPr>
+                <w:rFonts w:ascii="Aptos" w:hAnsi="Aptos"/>
+                <w:b w:val="0"/>
+                <w:sz w:val="19"/>
+              </w:rPr>
+              <w:t>Removed permanent INFO suppression after the in-memory history reached 85% capacity. The bounded deque rolls off old history while new events continue to subscribers and storage.</w:t>
+            </w:r>
+          </w:p>
+        </w:tc>
+      </w:tr>
+      <w:tr>
+        <w:tc>
+          <w:tcPr>
+            <w:tcW w:type="dxa" w:w="1944"/>
+            <w:vAlign w:val="center"/>
+          </w:tcPr>
+          <w:p>
+            <w:r/>
+            <w:r>
+              <w:rPr>
+                <w:rFonts w:ascii="Aptos" w:hAnsi="Aptos"/>
+                <w:b/>
+                <w:sz w:val="19"/>
+              </w:rPr>
+              <w:t>History dialogs</w:t>
+            </w:r>
+          </w:p>
+        </w:tc>
+        <w:tc>
+          <w:tcPr>
+            <w:tcW w:type="dxa" w:w="2880"/>
+            <w:vAlign w:val="center"/>
+          </w:tcPr>
+          <w:p>
+            <w:r/>
+            <w:r>
+              <w:rPr>
+                <w:rFonts w:ascii="Aptos" w:hAnsi="Aptos"/>
+                <w:b/>
+                <w:color w:val="087F5B"/>
+                <w:sz w:val="19"/>
+              </w:rPr>
+              <w:t>Fixed</w:t>
+            </w:r>
+          </w:p>
+        </w:tc>
+        <w:tc>
+          <w:tcPr>
+            <w:tcW w:type="dxa" w:w="5112"/>
+            <w:vAlign w:val="center"/>
+          </w:tcPr>
+          <w:p>
+            <w:r/>
+            <w:r>
+              <w:rPr>
+                <w:rFonts w:ascii="Aptos" w:hAnsi="Aptos"/>
+                <w:b w:val="0"/>
+                <w:sz w:val="19"/>
+              </w:rPr>
+              <w:t>Interactive 24-hour event views use severity-filtered SQL capped at 500 newest rows. After-Action Reports retain complete, uncapped run-window queries.</w:t>
+            </w:r>
+          </w:p>
+        </w:tc>
+      </w:tr>
+      <w:tr>
+        <w:tc>
+          <w:tcPr>
+            <w:tcW w:type="dxa" w:w="1944"/>
+            <w:vAlign w:val="center"/>
+          </w:tcPr>
+          <w:p>
+            <w:r/>
+            <w:r>
+              <w:rPr>
+                <w:rFonts w:ascii="Aptos" w:hAnsi="Aptos"/>
+                <w:b/>
+                <w:sz w:val="19"/>
+              </w:rPr>
+              <w:t>GUI exceptions</w:t>
+            </w:r>
+          </w:p>
+        </w:tc>
+        <w:tc>
+          <w:tcPr>
+            <w:tcW w:type="dxa" w:w="2880"/>
+            <w:vAlign w:val="center"/>
+          </w:tcPr>
+          <w:p>
+            <w:r/>
+            <w:r>
+              <w:rPr>
+                <w:rFonts w:ascii="Aptos" w:hAnsi="Aptos"/>
+                <w:b/>
+                <w:color w:val="087F5B"/>
+                <w:sz w:val="19"/>
+              </w:rPr>
+              <w:t>Fixed</w:t>
+            </w:r>
+          </w:p>
+        </w:tc>
+        <w:tc>
+          <w:tcPr>
+            <w:tcW w:type="dxa" w:w="5112"/>
+            <w:vAlign w:val="center"/>
+          </w:tcPr>
+          <w:p>
+            <w:r/>
+            <w:r>
+              <w:rPr>
+                <w:rFonts w:ascii="Aptos" w:hAnsi="Aptos"/>
+                <w:b w:val="0"/>
+                <w:sz w:val="19"/>
+              </w:rPr>
+              <w:t>Sandbox Editor uses valid QTextCursor movement enums; Settings uses the implemented autostart enable/disable functions; unchanged module-status tables are no longer rebuilt every 1.5 seconds.</w:t>
+            </w:r>
+          </w:p>
+        </w:tc>
+      </w:tr>
+      <w:tr>
+        <w:tc>
+          <w:tcPr>
+            <w:tcW w:type="dxa" w:w="1944"/>
+            <w:vAlign w:val="center"/>
+          </w:tcPr>
+          <w:p>
+            <w:r/>
+            <w:r>
+              <w:rPr>
+                <w:rFonts w:ascii="Aptos" w:hAnsi="Aptos"/>
+                <w:b/>
+                <w:sz w:val="19"/>
+              </w:rPr>
+              <w:t>A-04</w:t>
+            </w:r>
+          </w:p>
+        </w:tc>
+        <w:tc>
+          <w:tcPr>
+            <w:tcW w:type="dxa" w:w="2880"/>
+            <w:vAlign w:val="center"/>
+          </w:tcPr>
+          <w:p>
+            <w:r/>
+            <w:r>
+              <w:rPr>
+                <w:rFonts w:ascii="Aptos" w:hAnsi="Aptos"/>
+                <w:b/>
+                <w:color w:val="087F5B"/>
+                <w:sz w:val="19"/>
+              </w:rPr>
+              <w:t>Closed in default configuration</w:t>
+            </w:r>
+          </w:p>
+        </w:tc>
+        <w:tc>
+          <w:tcPr>
+            <w:tcW w:type="dxa" w:w="5112"/>
+            <w:vAlign w:val="center"/>
+          </w:tcPr>
+          <w:p>
+            <w:r/>
+            <w:r>
+              <w:rPr>
+                <w:rFonts w:ascii="Aptos" w:hAnsi="Aptos"/>
+                <w:b w:val="0"/>
+                <w:sz w:val="19"/>
+              </w:rPr>
+              <w:t>External Python drop-ins no longer execute automatically. Trusted development environments must explicitly set ANGERONA_EXTERNAL_MODULES=1.</w:t>
+            </w:r>
+          </w:p>
+        </w:tc>
+      </w:tr>
+      <w:tr>
+        <w:tc>
+          <w:tcPr>
+            <w:tcW w:type="dxa" w:w="1944"/>
+            <w:vAlign w:val="center"/>
+          </w:tcPr>
+          <w:p>
+            <w:r/>
+            <w:r>
+              <w:rPr>
+                <w:rFonts w:ascii="Aptos" w:hAnsi="Aptos"/>
+                <w:b/>
+                <w:sz w:val="19"/>
+              </w:rPr>
+              <w:t>A-07</w:t>
+            </w:r>
+          </w:p>
+        </w:tc>
+        <w:tc>
+          <w:tcPr>
+            <w:tcW w:type="dxa" w:w="2880"/>
+            <w:vAlign w:val="center"/>
+          </w:tcPr>
+          <w:p>
+            <w:r/>
+            <w:r>
+              <w:rPr>
+                <w:rFonts w:ascii="Aptos" w:hAnsi="Aptos"/>
+                <w:b/>
+                <w:color w:val="087F5B"/>
+                <w:sz w:val="19"/>
+              </w:rPr>
+              <w:t>Closed</w:t>
+            </w:r>
+          </w:p>
+        </w:tc>
+        <w:tc>
+          <w:tcPr>
+            <w:tcW w:type="dxa" w:w="5112"/>
+            <w:vAlign w:val="center"/>
+          </w:tcPr>
+          <w:p>
+            <w:r/>
+            <w:r>
+              <w:rPr>
+                <w:rFonts w:ascii="Aptos" w:hAnsi="Aptos"/>
+                <w:b w:val="0"/>
+                <w:sz w:val="19"/>
+              </w:rPr>
+              <w:t>Shadow Shield path identifiers now use SHA-256 instead of SHA-1.</w:t>
+            </w:r>
+          </w:p>
+        </w:tc>
+      </w:tr>
+      <w:tr>
+        <w:tc>
+          <w:tcPr>
+            <w:tcW w:type="dxa" w:w="1944"/>
+            <w:vAlign w:val="center"/>
+          </w:tcPr>
+          <w:p>
+            <w:r/>
+            <w:r>
+              <w:rPr>
+                <w:rFonts w:ascii="Aptos" w:hAnsi="Aptos"/>
+                <w:b/>
+                <w:sz w:val="19"/>
+              </w:rPr>
+              <w:t>A-06</w:t>
+            </w:r>
+          </w:p>
+        </w:tc>
+        <w:tc>
+          <w:tcPr>
+            <w:tcW w:type="dxa" w:w="2880"/>
+            <w:vAlign w:val="center"/>
+          </w:tcPr>
+          <w:p>
+            <w:r/>
+            <w:r>
+              <w:rPr>
+                <w:rFonts w:ascii="Aptos" w:hAnsi="Aptos"/>
+                <w:b/>
+                <w:color w:val="B26A00"/>
+                <w:sz w:val="19"/>
+              </w:rPr>
+              <w:t>Partially addressed</w:t>
+            </w:r>
+          </w:p>
+        </w:tc>
+        <w:tc>
+          <w:tcPr>
+            <w:tcW w:type="dxa" w:w="5112"/>
+            <w:vAlign w:val="center"/>
+          </w:tcPr>
+          <w:p>
+            <w:r/>
+            <w:r>
+              <w:rPr>
+                <w:rFonts w:ascii="Aptos" w:hAnsi="Aptos"/>
+                <w:b w:val="0"/>
+                <w:sz w:val="19"/>
+              </w:rPr>
+              <w:t>AI fix and revert scripts now reject additional defense-weakening, persistence, remote-execution, scheduled-task/service, Run-key, and firewall-disable patterns. A single centralized PowerShell executor/audit boundary remains recommended.</w:t>
+            </w:r>
+          </w:p>
+        </w:tc>
+      </w:tr>
+    </w:tbl>
+    <w:p>
+      <w:pPr>
+        <w:pStyle w:val="Heading2"/>
+      </w:pPr>
+      <w:r>
+        <w:t>Validation</w:t>
+      </w:r>
+    </w:p>
+    <w:p>
+      <w:r>
+        <w:t>Compilation and focused event-bus, storage, AMSI-default, and CVE-guardrail tests passed. The complete headless regression suite completed 26 of 26 phases with zero failures and a clean process exit, including the live benign red-team simulation and After-Action path.</w:t>
+      </w:r>
+    </w:p>
+    <w:p>
+      <w:pPr>
+        <w:pStyle w:val="Heading2"/>
+      </w:pPr>
+      <w:r>
+        <w:t>Residual assurance work</w:t>
+      </w:r>
+    </w:p>
+    <w:p>
+      <w:pPr>
+        <w:pStyle w:val="ListBullet"/>
+      </w:pPr>
+      <w:r>
+        <w:t>Run a true multi-hour desktop soak with representative alert and red-team bursts; the headless suite is not a substitute for elapsed-time GUI validation.</w:t>
+      </w:r>
+    </w:p>
+    <w:p>
+      <w:pPr>
+        <w:pStyle w:val="ListBullet"/>
+      </w:pPr>
+      <w:r>
+        <w:t>Keep ANGERONA_AMSI_INPROCESS disabled unless testing a known-compatible runtime; native ctypes failures cannot be recovered by Python exception handling.</w:t>
+      </w:r>
+    </w:p>
+    <w:p>
+      <w:pPr>
+        <w:pStyle w:val="ListBullet"/>
+      </w:pPr>
+      <w:r>
+        <w:t>Centralize every PowerShell invocation behind one policy, approval, integrity, and append-only audit boundary to fully close A-06.</w:t>
+      </w:r>
+    </w:p>
+    <w:p>
+      <w:pPr>
+        <w:pStyle w:val="ListBullet"/>
+      </w:pPr>
+      <w:r>
+        <w:t>Treat external modules as privileged code and leave external discovery disabled in normal deployments.</w:t>
+      </w:r>
+    </w:p>
+    <w:p>
+      <w:r>
+        <w:rPr>
+          <w:b/>
+        </w:rPr>
+        <w:t xml:space="preserve">Superseding validation note: </w:t>
+      </w:r>
+      <w:r>
+        <w:t>where an earlier 14 July addendum cites a 61-check module report, this sweep's final release-gate result is 26/26 end-to-end phases; individual stopped/idle modules remain reported as expected skips inside the module-level diagnostic output.</w:t>
+      </w:r>
+    </w:p>
+    <w:p>
+      <w:pPr>
+        <w:pStyle w:val="Heading1"/>
+      </w:pPr>
+      <w:r>
+        <w:t>Improvement Loop Release - 14 July 2026 (v1.7.5)</w:t>
+      </w:r>
+    </w:p>
+    <w:p>
+      <w:r>
+        <w:t>The three-round improvement loop found 12 distinct security weaknesses: nine were fixed and three were deliberately deferred because safe closure requires a versioned protocol or privileged deployment boundary.</w:t>
+      </w:r>
+    </w:p>
+    <w:p>
+      <w:pPr>
+        <w:pStyle w:val="ListBullet"/>
+      </w:pPr>
+      <w:r>
+        <w:t>Round 1: R1-01 through R1-04 fixed - AI-authored PowerShell is scanned before staging and execution, the elevated playbook gate fails closed on unsafe ACLs, and the dormant sniffer no longer starts on import or sends cleartext geolocation requests.</w:t>
+      </w:r>
+    </w:p>
+    <w:p>
+      <w:pPr>
+        <w:pStyle w:val="ListBullet"/>
+      </w:pPr>
+      <w:r>
+        <w:t>Round 2: R2-01, R2-03, and R2-04 fixed - hostile Authenticode paths remain data, event HMACs cover and persist complete details with verification on read, and MCP SSE/POST handling is concurrent and bounded. R2-02 is deferred for a versioned mutual-authentication and encrypted-channel migration.</w:t>
+      </w:r>
+    </w:p>
+    <w:p>
+      <w:pPr>
+        <w:pStyle w:val="ListBullet"/>
+      </w:pPr>
+      <w:r>
+        <w:t>Round 3: R3-03 and R3-04 fixed - generated containment uses a strict firewall-command allow-list plus a final PowerShell AST gate, and generated YARA must compile before atomic activation with last-known-good preservation. R3-01 and R3-02 remain deferred; malformed existing ledger keys now fail closed as partial hardening.</w:t>
+      </w:r>
+    </w:p>
+    <w:p>
+      <w:pPr>
+        <w:pStyle w:val="ListBullet"/>
+      </w:pPr>
+      <w:r>
+        <w:t>Defensive additions, not vulnerability closures: Evidence Lattice Fusion (ELAT) promotes corroborated structured MEDIUM evidence to an explainable HIGH event; Telemetry Expectation Contracts (TECT) now make DRILL require an exact ETW/EID 4688 echo rather than accepting its own announcement.</w:t>
+      </w:r>
+    </w:p>
+    <w:p>
+      <w:pPr>
+        <w:pStyle w:val="Heading2"/>
+      </w:pPr>
+      <w:r>
+        <w:t>Validation and remaining work</w:t>
+      </w:r>
+    </w:p>
+    <w:p>
+      <w:pPr>
+        <w:pStyle w:val="ListBullet"/>
+      </w:pPr>
+      <w:r>
+        <w:t>Release gates passed: 177/177 Python files compiled; 62/62 module files imported; 61 modules discovered with zero errors or duplicate codes; the full self-check passed 26/26 phases with zero failures.</w:t>
+      </w:r>
+    </w:p>
+    <w:p>
+      <w:pPr>
+        <w:pStyle w:val="ListBullet"/>
+      </w:pPr>
+      <w:r>
+        <w:t>Deferred security boundaries: Remote Bridge mutual authentication plus AEAD/mTLS (R2-02), an Administrator-owned packaged runtime and plug-in trust root (R3-01), and privileged/non-exportable ledger-key custody (R3-02). Broad PowerShell execution centralization (A-06) also remains open.</w:t>
+      </w:r>
+    </w:p>
+    <w:p>
+      <w:pPr>
+        <w:pStyle w:val="ListBullet"/>
+      </w:pPr>
+      <w:r>
+        <w:t>Proposed, not shipped: detector reuse of the shared connection cache, a global MCP request-worker cap, bounded reverse/indexed Evolution-feed lookup, isolated counterfactual replay, offline telemetry-failure mutation, keyed causal-ledger checkpoints, and local novelty sketches.</w:t>
+      </w:r>
+    </w:p>
     <w:sectPr>
       <w:pgSz w:w="12240" w:h="15840"/>
       <w:pgMar w:top="1440" w:right="1800" w:bottom="1440" w:left="1800" w:header="720" w:footer="720" w:gutter="0"/>

</xml_diff>